<commit_message>
Ajuste de redaccion en documentos Word
- Tono mas natural y cercano al estudiante
- Tildes correctas en todo el texto
- Frases mas cortas y vocabulario simplificado
- Mantengo cumplimiento APA y referencias academicas
</commit_message>
<xml_diff>
--- a/Entregable1/Entregable1_Documento_APA.docx
+++ b/Entregable1/Entregable1_Documento_APA.docx
@@ -17,9 +17,9 @@
           <w:b/>
           <w:sz w:val="28"/>
         </w:rPr>
-        <w:t>Analisis Exploratorio y Tratamiento Avanzado de Datos</w:t>
+        <w:t>Análisis Exploratorio y Tratamiento de Datos</w:t>
         <w:br/>
-        <w:t>sobre el Dataset Heart Disease (UCI)</w:t>
+        <w:t>en el Dataset Heart Disease (UCI)</w:t>
       </w:r>
     </w:p>
     <w:p/>
@@ -59,7 +59,7 @@
           <w:rFonts w:ascii="Times New Roman" w:hAnsi="Times New Roman"/>
           <w:sz w:val="24"/>
         </w:rPr>
-        <w:t>Programa de Desarrollo de Software, Noveno Semestre</w:t>
+        <w:t>Programa de Desarrollo de Software – Noveno Semestre</w:t>
       </w:r>
     </w:p>
     <w:p>
@@ -72,7 +72,7 @@
           <w:rFonts w:ascii="Times New Roman" w:hAnsi="Times New Roman"/>
           <w:sz w:val="24"/>
         </w:rPr>
-        <w:t>Seminario de Ciencia de los Datos</w:t>
+        <w:t>Seminario de Ciencia de Datos</w:t>
       </w:r>
     </w:p>
     <w:p>
@@ -98,7 +98,7 @@
           <w:rFonts w:ascii="Times New Roman" w:hAnsi="Times New Roman"/>
           <w:sz w:val="24"/>
         </w:rPr>
-        <w:t>20 de mayo de 2026</w:t>
+        <w:t>Mayo de 2026</w:t>
       </w:r>
     </w:p>
     <w:p>
@@ -130,7 +130,7 @@
           <w:rFonts w:ascii="Times New Roman" w:hAnsi="Times New Roman"/>
           <w:sz w:val="24"/>
         </w:rPr>
-        <w:t>El presente informe constituye el primer entregable del proyecto final del Seminario de Ciencia de los Datos. Se aborda el dataset Heart Disease del repositorio UCI Machine Learning (Cleveland Clinic Foundation), un conjunto de 303 observaciones con 14 atributos clinicos relacionados con el diagnostico de enfermedad coronaria. El trabajo aplica la metodologia CRISP-DM en sus fases de Comprension de los Datos y Preparacion de los Datos. Se documenta el analisis descriptivo, la evaluacion de la calidad de datos mediante pruebas de normalidad (Shapiro-Wilk) y aleatoriedad de datos faltantes (Wald-Wolfowitz), el tratamiento de outliers mediante el criterio de rango intercuartilico con capping y, finalmente, la comparacion entre dos estrategias de imputacion (mediana frente a regresion bayesiana iterativa). Los resultados evidencian no normalidad en las seis variables numericas continuas, un patron de nulos no aleatorio en la variable ca y una mejor preservacion de la distribucion original cuando se imputa mediante regresion. El dataset preprocesado queda listo para las fases de reduccion dimensional y modelado supervisado del segundo entregable.</w:t>
+        <w:t>Este informe corresponde al primer entregable del proyecto final del Seminario de Ciencia de Datos. El dataset elegido fue Heart Disease del repositorio UCI (Cleveland), con 303 registros y 14 variables clínicas sobre enfermedad coronaria. Siguiendo la metodología CRISP-DM se trabajaron las fases de comprensión y preparación de los datos. Se hicieron estadísticos descriptivos, se evaluó la normalidad con la prueba de Shapiro-Wilk, se aplicó la prueba de rachas para revisar el patrón de los datos faltantes, se trataron los outliers con la regla del IQR usando capping y se compararon dos técnicas de imputación (mediana e imputación por regresión bayesiana). Los principales hallazgos fueron que ninguna de las seis variables continuas analizadas es normal, que los nulos de la variable ca no aparecen de forma aleatoria y que la imputación por regresión conserva mejor la varianza que la imputación simple. Con esto el dataset queda listo para la reducción de dimensionalidad y el modelado del segundo entregable.</w:t>
       </w:r>
     </w:p>
     <w:p>
@@ -142,7 +142,7 @@
           <w:rFonts w:ascii="Times New Roman" w:hAnsi="Times New Roman"/>
           <w:sz w:val="24"/>
         </w:rPr>
-        <w:t>Palabras clave: analisis exploratorio, calidad de datos, imputacion, outliers, CRISP-DM, enfermedad cardiaca.</w:t>
+        <w:t>Palabras clave: análisis exploratorio, calidad de datos, imputación, outliers, CRISP-DM.</w:t>
       </w:r>
     </w:p>
     <w:p>
@@ -162,7 +162,7 @@
           <w:b/>
           <w:sz w:val="28"/>
         </w:rPr>
-        <w:t>Introduccion</w:t>
+        <w:t>Introducción</w:t>
       </w:r>
     </w:p>
     <w:p>
@@ -174,7 +174,7 @@
           <w:rFonts w:ascii="Times New Roman" w:hAnsi="Times New Roman"/>
           <w:sz w:val="24"/>
         </w:rPr>
-        <w:t>La calidad del modelo predictivo final en cualquier proyecto de ciencia de datos esta condicionada por la calidad del proceso de preparacion de datos. De acuerdo con la metodologia CRISP-DM (Cross Industry Standard Process for Data Mining), las fases de comprension y preparacion de los datos consumen entre el sesenta y el ochenta por ciento del tiempo total del proyecto (Chapman et al., 2000). En este informe se presenta dicho ejercicio sobre un caso de aplicacion real: la deteccion de enfermedad coronaria a partir de variables clinicas no invasivas.</w:t>
+        <w:t>En clase hemos visto que la calidad de un modelo de machine learning depende casi tanto del preprocesamiento como del algoritmo escogido. De hecho, CRISP-DM plantea que las fases de comprensión y preparación de los datos consumen entre el 60 % y el 80 % del tiempo de un proyecto (Chapman et al., 2000). Por eso este entregable se centra en hacer un análisis exploratorio cuidadoso antes de cualquier modelo.</w:t>
       </w:r>
     </w:p>
     <w:p>
@@ -186,7 +186,7 @@
           <w:rFonts w:ascii="Times New Roman" w:hAnsi="Times New Roman"/>
           <w:sz w:val="24"/>
         </w:rPr>
-        <w:t>El dataset Heart Disease (Cleveland) fue publicado por la Cleveland Clinic Foundation y es uno de los conjuntos mas referenciados en la literatura de aprendizaje automatico aplicado a medicina (Detrano et al., 1989). Sin embargo, presenta retos clasicos de calidad: valores faltantes codificados con el caracter '?', outliers en variables como colesterol y presion arterial, y variables categoricas codificadas numericamente que pueden ser interpretadas erroneamente como continuas.</w:t>
+        <w:t>Escogí el dataset Heart Disease (Cleveland) porque cumple con los tres criterios que pide el profesor: tiene nulos, tiene outliers y tiene más de 10 variables. Además es un problema de salud pública real: la enfermedad cardíaca es la primera causa de muerte en el mundo, y un buen clasificador puede ayudar a detectarla a tiempo. El dataset fue publicado originalmente por Detrano et al. (1989).</w:t>
       </w:r>
     </w:p>
     <w:p>
@@ -198,7 +198,7 @@
           <w:rFonts w:ascii="Times New Roman" w:hAnsi="Times New Roman"/>
           <w:sz w:val="24"/>
         </w:rPr>
-        <w:t>El objetivo del presente entregable es aplicar de manera rigurosa las tecnicas vistas en el seminario para entregar al cierre un dataset limpio, imputado y libre de valores extremos, sobre el cual se aplicaran las tecnicas de reduccion dimensional (PCA) y los modelos supervisados que componen el segundo entregable.</w:t>
+        <w:t>El objetivo del entregable es dejar el dataset limpio, sin nulos y con los outliers controlados, para poder aplicar PCA y comparar modelos supervisados en el segundo entregable.</w:t>
       </w:r>
     </w:p>
     <w:p>
@@ -238,7 +238,7 @@
           <w:rFonts w:ascii="Times New Roman" w:hAnsi="Times New Roman"/>
           <w:sz w:val="24"/>
         </w:rPr>
-        <w:t>Realizar el analisis exploratorio y el tratamiento avanzado del dataset Heart Disease, garantizando la calidad de los datos para el posterior modelado supervisado.</w:t>
+        <w:t>Hacer el análisis exploratorio del dataset Heart Disease y dejarlo preprocesado para la fase de modelado.</w:t>
       </w:r>
     </w:p>
     <w:p>
@@ -252,7 +252,7 @@
           <w:b/>
           <w:sz w:val="24"/>
         </w:rPr>
-        <w:t>Objetivos especificos</w:t>
+        <w:t>Objetivos específicos</w:t>
       </w:r>
     </w:p>
     <w:p>
@@ -266,13 +266,7 @@
           <w:rFonts w:ascii="Times New Roman" w:hAnsi="Times New Roman"/>
           <w:sz w:val="24"/>
         </w:rPr>
-      </w:r>
-      <w:r>
-        <w:rPr>
-          <w:rFonts w:ascii="Times New Roman" w:hAnsi="Times New Roman"/>
-          <w:sz w:val="24"/>
-        </w:rPr>
-        <w:t>Caracterizar el dataset mediante estadisticos descriptivos y la tipologia de cada variable.</w:t>
+        <w:t>Describir el dataset con estadísticos descriptivos y revisar los tipos de cada variable.</w:t>
       </w:r>
     </w:p>
     <w:p>
@@ -286,13 +280,7 @@
           <w:rFonts w:ascii="Times New Roman" w:hAnsi="Times New Roman"/>
           <w:sz w:val="24"/>
         </w:rPr>
-      </w:r>
-      <w:r>
-        <w:rPr>
-          <w:rFonts w:ascii="Times New Roman" w:hAnsi="Times New Roman"/>
-          <w:sz w:val="24"/>
-        </w:rPr>
-        <w:t>Evaluar la normalidad de las variables numericas mediante graficos Q-Q y la prueba de Shapiro-Wilk.</w:t>
+        <w:t>Verificar si las variables continuas siguen una distribución normal usando Q-Q plots y la prueba de Shapiro-Wilk.</w:t>
       </w:r>
     </w:p>
     <w:p>
@@ -306,13 +294,7 @@
           <w:rFonts w:ascii="Times New Roman" w:hAnsi="Times New Roman"/>
           <w:sz w:val="24"/>
         </w:rPr>
-      </w:r>
-      <w:r>
-        <w:rPr>
-          <w:rFonts w:ascii="Times New Roman" w:hAnsi="Times New Roman"/>
-          <w:sz w:val="24"/>
-        </w:rPr>
-        <w:t>Identificar el porcentaje y la aleatoriedad de los datos faltantes aplicando la prueba de rachas de Wald-Wolfowitz.</w:t>
+        <w:t>Identificar los datos faltantes y aplicar la prueba de rachas para evaluar si el patrón es aleatorio.</w:t>
       </w:r>
     </w:p>
     <w:p>
@@ -326,13 +308,7 @@
           <w:rFonts w:ascii="Times New Roman" w:hAnsi="Times New Roman"/>
           <w:sz w:val="24"/>
         </w:rPr>
-      </w:r>
-      <w:r>
-        <w:rPr>
-          <w:rFonts w:ascii="Times New Roman" w:hAnsi="Times New Roman"/>
-          <w:sz w:val="24"/>
-        </w:rPr>
-        <w:t>Detectar y tratar outliers mediante el criterio de rango intercuartilico, justificando la tecnica seleccionada.</w:t>
+        <w:t>Detectar y tratar outliers usando la regla del rango intercuartílico.</w:t>
       </w:r>
     </w:p>
     <w:p>
@@ -346,13 +322,7 @@
           <w:rFonts w:ascii="Times New Roman" w:hAnsi="Times New Roman"/>
           <w:sz w:val="24"/>
         </w:rPr>
-      </w:r>
-      <w:r>
-        <w:rPr>
-          <w:rFonts w:ascii="Times New Roman" w:hAnsi="Times New Roman"/>
-          <w:sz w:val="24"/>
-        </w:rPr>
-        <w:t>Comparar dos tecnicas de imputacion (mediana vs. regresion iterativa) sobre la variable con mayor cantidad de nulos.</w:t>
+        <w:t>Comparar dos métodos de imputación sobre la variable con más nulos.</w:t>
       </w:r>
     </w:p>
     <w:p>
@@ -372,7 +342,7 @@
           <w:b/>
           <w:sz w:val="28"/>
         </w:rPr>
-        <w:t>Marco Teorico</w:t>
+        <w:t>Marco teórico</w:t>
       </w:r>
     </w:p>
     <w:p>
@@ -386,7 +356,7 @@
           <w:b/>
           <w:sz w:val="26"/>
         </w:rPr>
-        <w:t>Metodologia CRISP-DM</w:t>
+        <w:t>Metodología CRISP-DM</w:t>
       </w:r>
     </w:p>
     <w:p>
@@ -398,7 +368,7 @@
           <w:rFonts w:ascii="Times New Roman" w:hAnsi="Times New Roman"/>
           <w:sz w:val="24"/>
         </w:rPr>
-        <w:t>CRISP-DM es un proceso iterativo compuesto por seis fases: Comprension del Negocio, Comprension de los Datos, Preparacion de los Datos, Modelado, Evaluacion y Despliegue (Chapman et al., 2000). El presente documento aborda las fases dos y tres, dejando el resto para el entregable dos.</w:t>
+        <w:t>CRISP-DM tiene seis fases: comprensión del negocio, comprensión de los datos, preparación de los datos, modelado, evaluación y despliegue (Chapman et al., 2000). Este entregable cubre las fases dos y tres; el resto queda para el segundo entregable.</w:t>
       </w:r>
     </w:p>
     <w:p>
@@ -412,7 +382,7 @@
           <w:b/>
           <w:sz w:val="26"/>
         </w:rPr>
-        <w:t>Pruebas estadisticas aplicadas</w:t>
+        <w:t>Prueba de Shapiro-Wilk</w:t>
       </w:r>
     </w:p>
     <w:p>
@@ -424,19 +394,7 @@
           <w:rFonts w:ascii="Times New Roman" w:hAnsi="Times New Roman"/>
           <w:sz w:val="24"/>
         </w:rPr>
-        <w:t>La prueba de Shapiro-Wilk (Shapiro y Wilk, 1965) contrasta la hipotesis nula de que una muestra proviene de una distribucion normal. Es considerada una de las pruebas mas potentes para tamanos de muestra moderados (n &lt; 2000). Con un nivel de significancia alpha de 0.05, se rechaza H0 cuando el p valor es menor a dicho umbral.</w:t>
-      </w:r>
-    </w:p>
-    <w:p>
-      <w:pPr>
-        <w:jc w:val="both"/>
-      </w:pPr>
-      <w:r>
-        <w:rPr>
-          <w:rFonts w:ascii="Times New Roman" w:hAnsi="Times New Roman"/>
-          <w:sz w:val="24"/>
-        </w:rPr>
-        <w:t>La prueba de rachas de Wald-Wolfowitz (Wald y Wolfowitz, 1940) evalua si una secuencia binaria es aleatoria. En el contexto de datos faltantes, una secuencia binaria que codifica la presencia (1) o ausencia (0) de valor permite inferir si el mecanismo de perdida es completamente aleatorio (MCAR) o si depende de la posicion o de otra variable (MAR/MNAR), siguiendo la tipologia de Rubin (1976).</w:t>
+        <w:t>La prueba de Shapiro-Wilk (Shapiro y Wilk, 1965) sirve para comprobar si una variable sigue una distribución normal. La hipótesis nula es que sí lo es; cuando el p-valor sale menor a 0.05 se rechaza esa hipótesis. Es de las pruebas más potentes para muestras de tamaño moderado (n menor a 2000), por eso fue la que aplicamos en clase.</w:t>
       </w:r>
     </w:p>
     <w:p>
@@ -450,7 +408,7 @@
           <w:b/>
           <w:sz w:val="26"/>
         </w:rPr>
-        <w:t>Tratamiento de outliers</w:t>
+        <w:t>Prueba de rachas de Wald-Wolfowitz</w:t>
       </w:r>
     </w:p>
     <w:p>
@@ -462,7 +420,7 @@
           <w:rFonts w:ascii="Times New Roman" w:hAnsi="Times New Roman"/>
           <w:sz w:val="24"/>
         </w:rPr>
-        <w:t>El criterio del rango intercuartilico considera valor atipico todo dato que se encuentra fuera del intervalo [Q1 - 1.5 * IQR, Q3 + 1.5 * IQR] (Tukey, 1977). Las opciones de tratamiento incluyen la eliminacion, el capping o winsorizing y la transformacion. En datasets pequenos se prefiere el capping para preservar el tamano muestral.</w:t>
+        <w:t>La prueba de rachas (Wald y Wolfowitz, 1940) revisa si una secuencia binaria es aleatoria. Aquí la usamos sobre los datos faltantes: armamos una secuencia con 1 cuando el valor está ausente y 0 cuando está presente. Si el p-valor es mayor a 0.05 se asume que los nulos aparecen al azar (mecanismo MCAR según la tipología de Rubin, 1976); si es menor, hay un patrón.</w:t>
       </w:r>
     </w:p>
     <w:p>
@@ -476,7 +434,7 @@
           <w:b/>
           <w:sz w:val="26"/>
         </w:rPr>
-        <w:t>Tecnicas de imputacion</w:t>
+        <w:t>Detección de outliers con IQR</w:t>
       </w:r>
     </w:p>
     <w:p>
@@ -488,7 +446,33 @@
           <w:rFonts w:ascii="Times New Roman" w:hAnsi="Times New Roman"/>
           <w:sz w:val="24"/>
         </w:rPr>
-        <w:t>La imputacion simple sustituye los valores faltantes por una medida de tendencia central (media, mediana, moda). Es rapida pero introduce sesgo y reduce la varianza de la variable. La imputacion multivariada iterativa, implementada en scikit-learn mediante la clase IterativeImputer y con un estimador BayesianRidge, modela cada variable con nulos como funcion del resto y la imputa de manera iterativa hasta converger. Esta estrategia preserva mejor las relaciones multivariantes (van Buuren, 2018).</w:t>
+        <w:t>El método del rango intercuartílico marca como atípico cualquier valor que esté fuera del intervalo [Q1 − 1.5·IQR, Q3 + 1.5·IQR] (Tukey, 1977). Para tratar los outliers se puede eliminar el registro, transformar la variable o hacer capping (reemplazar el valor por el límite). En este trabajo se usó capping para no perder filas.</w:t>
+      </w:r>
+    </w:p>
+    <w:p>
+      <w:pPr>
+        <w:spacing w:before="120" w:after="120"/>
+        <w:ind w:firstLine="0"/>
+      </w:pPr>
+      <w:r>
+        <w:rPr>
+          <w:rFonts w:ascii="Times New Roman" w:hAnsi="Times New Roman"/>
+          <w:b/>
+          <w:sz w:val="26"/>
+        </w:rPr>
+        <w:t>Técnicas de imputación</w:t>
+      </w:r>
+    </w:p>
+    <w:p>
+      <w:pPr>
+        <w:jc w:val="both"/>
+      </w:pPr>
+      <w:r>
+        <w:rPr>
+          <w:rFonts w:ascii="Times New Roman" w:hAnsi="Times New Roman"/>
+          <w:sz w:val="24"/>
+        </w:rPr>
+        <w:t>La imputación simple reemplaza los nulos con la media, mediana o moda. Es rápida pero introduce sesgo. La imputación iterativa de scikit-learn (IterativeImputer) usa un modelo de regresión (en este caso BayesianRidge) para predecir el valor faltante a partir de las demás variables. Esto preserva mejor las relaciones entre variables (van Buuren, 2018).</w:t>
       </w:r>
     </w:p>
     <w:p>
@@ -508,7 +492,7 @@
           <w:b/>
           <w:sz w:val="28"/>
         </w:rPr>
-        <w:t>Metodologia</w:t>
+        <w:t>Metodología</w:t>
       </w:r>
     </w:p>
     <w:p>
@@ -520,7 +504,7 @@
           <w:rFonts w:ascii="Times New Roman" w:hAnsi="Times New Roman"/>
           <w:sz w:val="24"/>
         </w:rPr>
-        <w:t>El analisis se desarrollo en Python 3.13 utilizando las librerias pandas, numpy, matplotlib, seaborn, scipy y scikit-learn. El entorno se documenta en un cuaderno Jupyter ejecutable (Entregable1_EDA_HeartDisease.ipynb) anexo a este informe. El procedimiento siguio cinco etapas alineadas con el cronograma del seminario.</w:t>
+        <w:t>El análisis se desarrolló en Python 3.13 usando pandas, numpy, matplotlib, seaborn, scipy y scikit-learn. Todo el código está en el notebook adjunto (Entregable1_EDA_HeartDisease.ipynb) y es reproducible: el notebook descarga el dataset directamente del repositorio UCI.</w:t>
       </w:r>
     </w:p>
     <w:p>
@@ -534,7 +518,7 @@
           <w:b/>
           <w:sz w:val="26"/>
         </w:rPr>
-        <w:t>Descripcion del dataset</w:t>
+        <w:t>Descripción del dataset</w:t>
       </w:r>
     </w:p>
     <w:p>
@@ -546,7 +530,7 @@
           <w:rFonts w:ascii="Times New Roman" w:hAnsi="Times New Roman"/>
           <w:sz w:val="24"/>
         </w:rPr>
-        <w:t>El dataset Cleveland contiene 303 instancias y 14 atributos. La variable objetivo num indica la severidad de la enfermedad (0 a 4). Para este trabajo se construyo una variable binaria target donde 0 corresponde a sin enfermedad y 1 a presencia de enfermedad (num &gt;= 1).</w:t>
+        <w:t>El dataset Cleveland tiene 303 instancias y 14 atributos. La variable num indica la severidad de la enfermedad (de 0 a 4). Para simplificar el problema a clasificación binaria creé la variable target, que vale 0 si num es 0 (sano) y 1 en cualquier otro caso (con enfermedad).</w:t>
       </w:r>
     </w:p>
     <w:p>
@@ -568,7 +552,7 @@
           <w:i/>
           <w:sz w:val="22"/>
         </w:rPr>
-        <w:t>Diccionario de variables del dataset Heart Disease (Cleveland)</w:t>
+        <w:t>Diccionario de variables del dataset</w:t>
       </w:r>
     </w:p>
     <w:tbl>
@@ -609,7 +593,7 @@
                 <w:b/>
                 <w:sz w:val="21"/>
               </w:rPr>
-              <w:t>Descripcion</w:t>
+              <w:t>Descripción</w:t>
             </w:r>
           </w:p>
         </w:tc>
@@ -654,7 +638,7 @@
                 <w:rFonts w:ascii="Times New Roman" w:hAnsi="Times New Roman"/>
                 <w:sz w:val="21"/>
               </w:rPr>
-              <w:t>Edad en anos</w:t>
+              <w:t>Edad en años</w:t>
             </w:r>
           </w:p>
         </w:tc>
@@ -668,7 +652,7 @@
                 <w:rFonts w:ascii="Times New Roman" w:hAnsi="Times New Roman"/>
                 <w:sz w:val="21"/>
               </w:rPr>
-              <w:t>Numerica continua</w:t>
+              <w:t>Numérica continua</w:t>
             </w:r>
           </w:p>
         </w:tc>
@@ -712,7 +696,7 @@
                 <w:rFonts w:ascii="Times New Roman" w:hAnsi="Times New Roman"/>
                 <w:sz w:val="21"/>
               </w:rPr>
-              <w:t>Categorica binaria</w:t>
+              <w:t>Categórica binaria</w:t>
             </w:r>
           </w:p>
         </w:tc>
@@ -742,7 +726,7 @@
                 <w:rFonts w:ascii="Times New Roman" w:hAnsi="Times New Roman"/>
                 <w:sz w:val="21"/>
               </w:rPr>
-              <w:t>Tipo de dolor toracico (1-4)</w:t>
+              <w:t>Tipo de dolor torácico (1–4)</w:t>
             </w:r>
           </w:p>
         </w:tc>
@@ -756,7 +740,7 @@
                 <w:rFonts w:ascii="Times New Roman" w:hAnsi="Times New Roman"/>
                 <w:sz w:val="21"/>
               </w:rPr>
-              <w:t>Categorica ordinal</w:t>
+              <w:t>Categórica ordinal</w:t>
             </w:r>
           </w:p>
         </w:tc>
@@ -786,7 +770,7 @@
                 <w:rFonts w:ascii="Times New Roman" w:hAnsi="Times New Roman"/>
                 <w:sz w:val="21"/>
               </w:rPr>
-              <w:t>Presion arterial en reposo (mm Hg)</w:t>
+              <w:t>Presión arterial en reposo (mm Hg)</w:t>
             </w:r>
           </w:p>
         </w:tc>
@@ -800,7 +784,7 @@
                 <w:rFonts w:ascii="Times New Roman" w:hAnsi="Times New Roman"/>
                 <w:sz w:val="21"/>
               </w:rPr>
-              <w:t>Numerica continua</w:t>
+              <w:t>Numérica continua</w:t>
             </w:r>
           </w:p>
         </w:tc>
@@ -830,7 +814,7 @@
                 <w:rFonts w:ascii="Times New Roman" w:hAnsi="Times New Roman"/>
                 <w:sz w:val="21"/>
               </w:rPr>
-              <w:t>Colesterol serico (mg/dl)</w:t>
+              <w:t>Colesterol sérico (mg/dl)</w:t>
             </w:r>
           </w:p>
         </w:tc>
@@ -844,7 +828,7 @@
                 <w:rFonts w:ascii="Times New Roman" w:hAnsi="Times New Roman"/>
                 <w:sz w:val="21"/>
               </w:rPr>
-              <w:t>Numerica continua</w:t>
+              <w:t>Numérica continua</w:t>
             </w:r>
           </w:p>
         </w:tc>
@@ -888,7 +872,7 @@
                 <w:rFonts w:ascii="Times New Roman" w:hAnsi="Times New Roman"/>
                 <w:sz w:val="21"/>
               </w:rPr>
-              <w:t>Categorica binaria</w:t>
+              <w:t>Categórica binaria</w:t>
             </w:r>
           </w:p>
         </w:tc>
@@ -918,7 +902,7 @@
                 <w:rFonts w:ascii="Times New Roman" w:hAnsi="Times New Roman"/>
                 <w:sz w:val="21"/>
               </w:rPr>
-              <w:t>Electrocardiograma en reposo (0-2)</w:t>
+              <w:t>Electrocardiograma en reposo (0–2)</w:t>
             </w:r>
           </w:p>
         </w:tc>
@@ -932,7 +916,7 @@
                 <w:rFonts w:ascii="Times New Roman" w:hAnsi="Times New Roman"/>
                 <w:sz w:val="21"/>
               </w:rPr>
-              <w:t>Categorica ordinal</w:t>
+              <w:t>Categórica ordinal</w:t>
             </w:r>
           </w:p>
         </w:tc>
@@ -962,7 +946,7 @@
                 <w:rFonts w:ascii="Times New Roman" w:hAnsi="Times New Roman"/>
                 <w:sz w:val="21"/>
               </w:rPr>
-              <w:t>Frecuencia cardiaca maxima alcanzada</w:t>
+              <w:t>Frecuencia cardíaca máxima</w:t>
             </w:r>
           </w:p>
         </w:tc>
@@ -976,7 +960,7 @@
                 <w:rFonts w:ascii="Times New Roman" w:hAnsi="Times New Roman"/>
                 <w:sz w:val="21"/>
               </w:rPr>
-              <w:t>Numerica continua</w:t>
+              <w:t>Numérica continua</w:t>
             </w:r>
           </w:p>
         </w:tc>
@@ -1006,7 +990,7 @@
                 <w:rFonts w:ascii="Times New Roman" w:hAnsi="Times New Roman"/>
                 <w:sz w:val="21"/>
               </w:rPr>
-              <w:t>Angina inducida por ejercicio (1/0)</w:t>
+              <w:t>Angina inducida por ejercicio</w:t>
             </w:r>
           </w:p>
         </w:tc>
@@ -1020,7 +1004,7 @@
                 <w:rFonts w:ascii="Times New Roman" w:hAnsi="Times New Roman"/>
                 <w:sz w:val="21"/>
               </w:rPr>
-              <w:t>Categorica binaria</w:t>
+              <w:t>Categórica binaria</w:t>
             </w:r>
           </w:p>
         </w:tc>
@@ -1050,7 +1034,7 @@
                 <w:rFonts w:ascii="Times New Roman" w:hAnsi="Times New Roman"/>
                 <w:sz w:val="21"/>
               </w:rPr>
-              <w:t>Depresion ST por ejercicio</w:t>
+              <w:t>Depresión ST por ejercicio</w:t>
             </w:r>
           </w:p>
         </w:tc>
@@ -1064,7 +1048,7 @@
                 <w:rFonts w:ascii="Times New Roman" w:hAnsi="Times New Roman"/>
                 <w:sz w:val="21"/>
               </w:rPr>
-              <w:t>Numerica continua</w:t>
+              <w:t>Numérica continua</w:t>
             </w:r>
           </w:p>
         </w:tc>
@@ -1094,7 +1078,7 @@
                 <w:rFonts w:ascii="Times New Roman" w:hAnsi="Times New Roman"/>
                 <w:sz w:val="21"/>
               </w:rPr>
-              <w:t>Pendiente segmento ST (1-3)</w:t>
+              <w:t>Pendiente del segmento ST</w:t>
             </w:r>
           </w:p>
         </w:tc>
@@ -1108,7 +1092,7 @@
                 <w:rFonts w:ascii="Times New Roman" w:hAnsi="Times New Roman"/>
                 <w:sz w:val="21"/>
               </w:rPr>
-              <w:t>Categorica ordinal</w:t>
+              <w:t>Categórica ordinal</w:t>
             </w:r>
           </w:p>
         </w:tc>
@@ -1138,7 +1122,7 @@
                 <w:rFonts w:ascii="Times New Roman" w:hAnsi="Times New Roman"/>
                 <w:sz w:val="21"/>
               </w:rPr>
-              <w:t>Vasos coloreados por fluoroscopia (0-3)</w:t>
+              <w:t>Vasos coloreados por fluoroscopia</w:t>
             </w:r>
           </w:p>
         </w:tc>
@@ -1152,7 +1136,7 @@
                 <w:rFonts w:ascii="Times New Roman" w:hAnsi="Times New Roman"/>
                 <w:sz w:val="21"/>
               </w:rPr>
-              <w:t>Numerica discreta</w:t>
+              <w:t>Numérica discreta</w:t>
             </w:r>
           </w:p>
         </w:tc>
@@ -1196,7 +1180,7 @@
                 <w:rFonts w:ascii="Times New Roman" w:hAnsi="Times New Roman"/>
                 <w:sz w:val="21"/>
               </w:rPr>
-              <w:t>Categorica nominal</w:t>
+              <w:t>Categórica nominal</w:t>
             </w:r>
           </w:p>
         </w:tc>
@@ -1226,7 +1210,7 @@
                 <w:rFonts w:ascii="Times New Roman" w:hAnsi="Times New Roman"/>
                 <w:sz w:val="21"/>
               </w:rPr>
-              <w:t>Diagnostico original (0-4)</w:t>
+              <w:t>Diagnóstico original (0–4)</w:t>
             </w:r>
           </w:p>
         </w:tc>
@@ -1240,7 +1224,7 @@
                 <w:rFonts w:ascii="Times New Roman" w:hAnsi="Times New Roman"/>
                 <w:sz w:val="21"/>
               </w:rPr>
-              <w:t>Categorica ordinal</w:t>
+              <w:t>Categórica ordinal</w:t>
             </w:r>
           </w:p>
         </w:tc>
@@ -1270,7 +1254,7 @@
                 <w:rFonts w:ascii="Times New Roman" w:hAnsi="Times New Roman"/>
                 <w:sz w:val="21"/>
               </w:rPr>
-              <w:t>Diagnostico binarizado</w:t>
+              <w:t>Diagnóstico binarizado</w:t>
             </w:r>
           </w:p>
         </w:tc>
@@ -1284,7 +1268,7 @@
                 <w:rFonts w:ascii="Times New Roman" w:hAnsi="Times New Roman"/>
                 <w:sz w:val="21"/>
               </w:rPr>
-              <w:t>Categorica binaria</w:t>
+              <w:t>Categórica binaria</w:t>
             </w:r>
           </w:p>
         </w:tc>
@@ -1322,7 +1306,7 @@
           <w:b/>
           <w:sz w:val="26"/>
         </w:rPr>
-        <w:t>I. Analisis descriptivo y de calidad</w:t>
+        <w:t>I. Análisis descriptivo y de calidad</w:t>
       </w:r>
     </w:p>
     <w:p>
@@ -1334,7 +1318,7 @@
           <w:rFonts w:ascii="Times New Roman" w:hAnsi="Times New Roman"/>
           <w:sz w:val="24"/>
         </w:rPr>
-        <w:t>El dataset tiene dimensiones de 303 filas por 14 columnas. La variable edad tiene media de 54.4 anos con desviacion estandar de 9.0, concentrandose en el rango de 48 a 61 anos. El colesterol presenta una amplitud notable (126 a 564 mg/dl) lo que anticipa la presencia de outliers. El balance entre clases del target es de 54% sin enfermedad y 46% con enfermedad, un balance favorable para clasificacion sin necesidad de tecnicas de rebalanceo.</w:t>
+        <w:t>El dataset tiene 303 filas y 14 columnas. La edad promedio es de 54.4 años con desviación estándar de 9 años. Lo primero que llama la atención al revisar los estadísticos es el rango del colesterol: va desde 126 hasta 564 mg/dl, lo que ya anticipa que va a haber outliers. La distribución entre las dos clases del target es 54 % sin enfermedad y 46 % con enfermedad, así que no hay un problema fuerte de desbalance.</w:t>
       </w:r>
     </w:p>
     <w:p>
@@ -1346,7 +1330,7 @@
           <w:rFonts w:ascii="Times New Roman" w:hAnsi="Times New Roman"/>
           <w:sz w:val="24"/>
         </w:rPr>
-        <w:t>La Tabla 2 sintetiza los estadisticos descriptivos para las seis variables numericas continuas analizadas en este informe. Se reportan el conteo de observaciones validas, la media, la desviacion estandar, los cuantiles (Q1, mediana, Q3) y los valores extremos. Estos estadisticos son la base para las decisiones de preprocesamiento que se documentan en las secciones siguientes.</w:t>
+        <w:t>La Tabla 2 muestra los estadísticos descriptivos de las seis variables continuas con las que se hará el análisis de calidad. Aquí también se ve que la variable ca tiene solo 299 observaciones válidas, lo cual confirma que hay nulos.</w:t>
       </w:r>
     </w:p>
     <w:p>
@@ -1368,7 +1352,7 @@
           <w:i/>
           <w:sz w:val="22"/>
         </w:rPr>
-        <w:t>Estadisticos descriptivos de las variables numericas continuas</w:t>
+        <w:t>Estadísticos descriptivos de las variables continuas</w:t>
       </w:r>
     </w:p>
     <w:tbl>
@@ -1445,7 +1429,7 @@
                 <w:b/>
                 <w:sz w:val="21"/>
               </w:rPr>
-              <w:t>Desv. estandar</w:t>
+              <w:t>DE</w:t>
             </w:r>
           </w:p>
         </w:tc>
@@ -1460,7 +1444,7 @@
                 <w:b/>
                 <w:sz w:val="21"/>
               </w:rPr>
-              <w:t>Min.</w:t>
+              <w:t>Mín.</w:t>
             </w:r>
           </w:p>
         </w:tc>
@@ -1520,7 +1504,7 @@
                 <w:b/>
                 <w:sz w:val="21"/>
               </w:rPr>
-              <w:t>Max.</w:t>
+              <w:t>Máx.</w:t>
             </w:r>
           </w:p>
         </w:tc>
@@ -1592,7 +1576,7 @@
                 <w:rFonts w:ascii="Times New Roman" w:hAnsi="Times New Roman"/>
                 <w:sz w:val="21"/>
               </w:rPr>
-              <w:t>29.00</w:t>
+              <w:t>29</w:t>
             </w:r>
           </w:p>
         </w:tc>
@@ -1606,7 +1590,7 @@
                 <w:rFonts w:ascii="Times New Roman" w:hAnsi="Times New Roman"/>
                 <w:sz w:val="21"/>
               </w:rPr>
-              <w:t>48.00</w:t>
+              <w:t>48</w:t>
             </w:r>
           </w:p>
         </w:tc>
@@ -1620,7 +1604,7 @@
                 <w:rFonts w:ascii="Times New Roman" w:hAnsi="Times New Roman"/>
                 <w:sz w:val="21"/>
               </w:rPr>
-              <w:t>56.00</w:t>
+              <w:t>56</w:t>
             </w:r>
           </w:p>
         </w:tc>
@@ -1634,7 +1618,7 @@
                 <w:rFonts w:ascii="Times New Roman" w:hAnsi="Times New Roman"/>
                 <w:sz w:val="21"/>
               </w:rPr>
-              <w:t>61.00</w:t>
+              <w:t>61</w:t>
             </w:r>
           </w:p>
         </w:tc>
@@ -1648,7 +1632,7 @@
                 <w:rFonts w:ascii="Times New Roman" w:hAnsi="Times New Roman"/>
                 <w:sz w:val="21"/>
               </w:rPr>
-              <w:t>77.00</w:t>
+              <w:t>77</w:t>
             </w:r>
           </w:p>
         </w:tc>
@@ -1720,7 +1704,7 @@
                 <w:rFonts w:ascii="Times New Roman" w:hAnsi="Times New Roman"/>
                 <w:sz w:val="21"/>
               </w:rPr>
-              <w:t>94.00</w:t>
+              <w:t>94</w:t>
             </w:r>
           </w:p>
         </w:tc>
@@ -1734,7 +1718,7 @@
                 <w:rFonts w:ascii="Times New Roman" w:hAnsi="Times New Roman"/>
                 <w:sz w:val="21"/>
               </w:rPr>
-              <w:t>120.00</w:t>
+              <w:t>120</w:t>
             </w:r>
           </w:p>
         </w:tc>
@@ -1748,7 +1732,7 @@
                 <w:rFonts w:ascii="Times New Roman" w:hAnsi="Times New Roman"/>
                 <w:sz w:val="21"/>
               </w:rPr>
-              <w:t>130.00</w:t>
+              <w:t>130</w:t>
             </w:r>
           </w:p>
         </w:tc>
@@ -1762,7 +1746,7 @@
                 <w:rFonts w:ascii="Times New Roman" w:hAnsi="Times New Roman"/>
                 <w:sz w:val="21"/>
               </w:rPr>
-              <w:t>140.00</w:t>
+              <w:t>140</w:t>
             </w:r>
           </w:p>
         </w:tc>
@@ -1776,7 +1760,7 @@
                 <w:rFonts w:ascii="Times New Roman" w:hAnsi="Times New Roman"/>
                 <w:sz w:val="21"/>
               </w:rPr>
-              <w:t>200.00</w:t>
+              <w:t>200</w:t>
             </w:r>
           </w:p>
         </w:tc>
@@ -1848,7 +1832,7 @@
                 <w:rFonts w:ascii="Times New Roman" w:hAnsi="Times New Roman"/>
                 <w:sz w:val="21"/>
               </w:rPr>
-              <w:t>126.00</w:t>
+              <w:t>126</w:t>
             </w:r>
           </w:p>
         </w:tc>
@@ -1862,7 +1846,7 @@
                 <w:rFonts w:ascii="Times New Roman" w:hAnsi="Times New Roman"/>
                 <w:sz w:val="21"/>
               </w:rPr>
-              <w:t>211.00</w:t>
+              <w:t>211</w:t>
             </w:r>
           </w:p>
         </w:tc>
@@ -1876,7 +1860,7 @@
                 <w:rFonts w:ascii="Times New Roman" w:hAnsi="Times New Roman"/>
                 <w:sz w:val="21"/>
               </w:rPr>
-              <w:t>241.00</w:t>
+              <w:t>241</w:t>
             </w:r>
           </w:p>
         </w:tc>
@@ -1890,7 +1874,7 @@
                 <w:rFonts w:ascii="Times New Roman" w:hAnsi="Times New Roman"/>
                 <w:sz w:val="21"/>
               </w:rPr>
-              <w:t>275.00</w:t>
+              <w:t>275</w:t>
             </w:r>
           </w:p>
         </w:tc>
@@ -1904,7 +1888,7 @@
                 <w:rFonts w:ascii="Times New Roman" w:hAnsi="Times New Roman"/>
                 <w:sz w:val="21"/>
               </w:rPr>
-              <w:t>564.00</w:t>
+              <w:t>564</w:t>
             </w:r>
           </w:p>
         </w:tc>
@@ -1976,7 +1960,7 @@
                 <w:rFonts w:ascii="Times New Roman" w:hAnsi="Times New Roman"/>
                 <w:sz w:val="21"/>
               </w:rPr>
-              <w:t>71.00</w:t>
+              <w:t>71</w:t>
             </w:r>
           </w:p>
         </w:tc>
@@ -1990,7 +1974,7 @@
                 <w:rFonts w:ascii="Times New Roman" w:hAnsi="Times New Roman"/>
                 <w:sz w:val="21"/>
               </w:rPr>
-              <w:t>133.50</w:t>
+              <w:t>133.5</w:t>
             </w:r>
           </w:p>
         </w:tc>
@@ -2004,7 +1988,7 @@
                 <w:rFonts w:ascii="Times New Roman" w:hAnsi="Times New Roman"/>
                 <w:sz w:val="21"/>
               </w:rPr>
-              <w:t>153.00</w:t>
+              <w:t>153</w:t>
             </w:r>
           </w:p>
         </w:tc>
@@ -2018,7 +2002,7 @@
                 <w:rFonts w:ascii="Times New Roman" w:hAnsi="Times New Roman"/>
                 <w:sz w:val="21"/>
               </w:rPr>
-              <w:t>166.00</w:t>
+              <w:t>166</w:t>
             </w:r>
           </w:p>
         </w:tc>
@@ -2032,7 +2016,7 @@
                 <w:rFonts w:ascii="Times New Roman" w:hAnsi="Times New Roman"/>
                 <w:sz w:val="21"/>
               </w:rPr>
-              <w:t>202.00</w:t>
+              <w:t>202</w:t>
             </w:r>
           </w:p>
         </w:tc>
@@ -2104,7 +2088,7 @@
                 <w:rFonts w:ascii="Times New Roman" w:hAnsi="Times New Roman"/>
                 <w:sz w:val="21"/>
               </w:rPr>
-              <w:t>0.00</w:t>
+              <w:t>0</w:t>
             </w:r>
           </w:p>
         </w:tc>
@@ -2118,7 +2102,7 @@
                 <w:rFonts w:ascii="Times New Roman" w:hAnsi="Times New Roman"/>
                 <w:sz w:val="21"/>
               </w:rPr>
-              <w:t>0.00</w:t>
+              <w:t>0</w:t>
             </w:r>
           </w:p>
         </w:tc>
@@ -2132,7 +2116,7 @@
                 <w:rFonts w:ascii="Times New Roman" w:hAnsi="Times New Roman"/>
                 <w:sz w:val="21"/>
               </w:rPr>
-              <w:t>0.80</w:t>
+              <w:t>0.8</w:t>
             </w:r>
           </w:p>
         </w:tc>
@@ -2146,7 +2130,7 @@
                 <w:rFonts w:ascii="Times New Roman" w:hAnsi="Times New Roman"/>
                 <w:sz w:val="21"/>
               </w:rPr>
-              <w:t>1.60</w:t>
+              <w:t>1.6</w:t>
             </w:r>
           </w:p>
         </w:tc>
@@ -2160,7 +2144,7 @@
                 <w:rFonts w:ascii="Times New Roman" w:hAnsi="Times New Roman"/>
                 <w:sz w:val="21"/>
               </w:rPr>
-              <w:t>6.20</w:t>
+              <w:t>6.2</w:t>
             </w:r>
           </w:p>
         </w:tc>
@@ -2232,7 +2216,7 @@
                 <w:rFonts w:ascii="Times New Roman" w:hAnsi="Times New Roman"/>
                 <w:sz w:val="21"/>
               </w:rPr>
-              <w:t>0.00</w:t>
+              <w:t>0</w:t>
             </w:r>
           </w:p>
         </w:tc>
@@ -2246,7 +2230,7 @@
                 <w:rFonts w:ascii="Times New Roman" w:hAnsi="Times New Roman"/>
                 <w:sz w:val="21"/>
               </w:rPr>
-              <w:t>0.00</w:t>
+              <w:t>0</w:t>
             </w:r>
           </w:p>
         </w:tc>
@@ -2260,7 +2244,7 @@
                 <w:rFonts w:ascii="Times New Roman" w:hAnsi="Times New Roman"/>
                 <w:sz w:val="21"/>
               </w:rPr>
-              <w:t>0.00</w:t>
+              <w:t>0</w:t>
             </w:r>
           </w:p>
         </w:tc>
@@ -2274,7 +2258,7 @@
                 <w:rFonts w:ascii="Times New Roman" w:hAnsi="Times New Roman"/>
                 <w:sz w:val="21"/>
               </w:rPr>
-              <w:t>1.00</w:t>
+              <w:t>1</w:t>
             </w:r>
           </w:p>
         </w:tc>
@@ -2288,7 +2272,7 @@
                 <w:rFonts w:ascii="Times New Roman" w:hAnsi="Times New Roman"/>
                 <w:sz w:val="21"/>
               </w:rPr>
-              <w:t>3.00</w:t>
+              <w:t>3</w:t>
             </w:r>
           </w:p>
         </w:tc>
@@ -2304,7 +2288,7 @@
           <w:rFonts w:ascii="Times New Roman" w:hAnsi="Times New Roman"/>
           <w:sz w:val="24"/>
         </w:rPr>
-        <w:t>La variable ca presenta solo 299 observaciones validas, evidenciando la presencia de cuatro valores faltantes que se trataran en la seccion III. La media de oldpeak (1.04) es notablemente superior a su mediana (0.80), lo que sugiere asimetria positiva confirmada posteriormente por la prueba de normalidad. De forma analoga, ca muestra una diferencia marcada entre la media (0.67) y la mediana (0.00), reflejando una concentracion de observaciones en el valor cero.</w:t>
+        <w:t>Otra cosa interesante: en oldpeak la media (1.04) es bastante mayor que la mediana (0.80), lo que indica que la distribución está sesgada hacia la derecha. Lo mismo pasa con ca, donde la mediana es 0 pero la media es 0.67. Esto se confirma en la sección siguiente con la prueba de normalidad.</w:t>
       </w:r>
     </w:p>
     <w:p>
@@ -2318,7 +2302,7 @@
           <w:b/>
           <w:sz w:val="26"/>
         </w:rPr>
-        <w:t>II. Evaluacion de la calidad - normalidad</w:t>
+        <w:t>II. Evaluación de la calidad – Normalidad</w:t>
       </w:r>
     </w:p>
     <w:p>
@@ -2330,7 +2314,7 @@
           <w:rFonts w:ascii="Times New Roman" w:hAnsi="Times New Roman"/>
           <w:sz w:val="24"/>
         </w:rPr>
-        <w:t>Se aplicaron tres herramientas complementarias: histograma con curva de densidad, grafico Q-Q y prueba de Shapiro-Wilk. Los histogramas se presentan en la Figura 1.</w:t>
+        <w:t>Para evaluar normalidad usé tres herramientas: histograma con curva de densidad, gráfico Q-Q y la prueba de Shapiro-Wilk.</w:t>
       </w:r>
     </w:p>
     <w:p>
@@ -2341,7 +2325,7 @@
       <w:r>
         <w:drawing>
           <wp:inline xmlns:a="http://schemas.openxmlformats.org/drawingml/2006/main" xmlns:pic="http://schemas.openxmlformats.org/drawingml/2006/picture">
-            <wp:extent cx="5486400" cy="3110150"/>
+            <wp:extent cx="5486400" cy="3103103"/>
             <wp:docPr id="1" name="Picture 1"/>
             <wp:cNvGraphicFramePr>
               <a:graphicFrameLocks noChangeAspect="1"/>
@@ -2362,7 +2346,7 @@
                   <pic:spPr>
                     <a:xfrm>
                       <a:off x="0" y="0"/>
-                      <a:ext cx="5486400" cy="3110150"/>
+                      <a:ext cx="5486400" cy="3103103"/>
                     </a:xfrm>
                     <a:prstGeom prst="rect"/>
                   </pic:spPr>
@@ -2376,7 +2360,6 @@
     <w:p>
       <w:pPr>
         <w:ind w:firstLine="0"/>
-        <w:jc w:val="left"/>
       </w:pPr>
       <w:r>
         <w:rPr>
@@ -2393,7 +2376,7 @@
           <w:i/>
           <w:sz w:val="22"/>
         </w:rPr>
-        <w:t>Histogramas con curva de densidad para las seis variables numericas continuas. Elaboracion propia.</w:t>
+        <w:t>Histogramas con curva de densidad para las seis variables continuas.</w:t>
       </w:r>
     </w:p>
     <w:p>
@@ -2404,7 +2387,7 @@
       <w:r>
         <w:drawing>
           <wp:inline xmlns:a="http://schemas.openxmlformats.org/drawingml/2006/main" xmlns:pic="http://schemas.openxmlformats.org/drawingml/2006/picture">
-            <wp:extent cx="5486400" cy="3107903"/>
+            <wp:extent cx="5486400" cy="3103103"/>
             <wp:docPr id="2" name="Picture 2"/>
             <wp:cNvGraphicFramePr>
               <a:graphicFrameLocks noChangeAspect="1"/>
@@ -2425,7 +2408,7 @@
                   <pic:spPr>
                     <a:xfrm>
                       <a:off x="0" y="0"/>
-                      <a:ext cx="5486400" cy="3107903"/>
+                      <a:ext cx="5486400" cy="3103103"/>
                     </a:xfrm>
                     <a:prstGeom prst="rect"/>
                   </pic:spPr>
@@ -2439,7 +2422,6 @@
     <w:p>
       <w:pPr>
         <w:ind w:firstLine="0"/>
-        <w:jc w:val="left"/>
       </w:pPr>
       <w:r>
         <w:rPr>
@@ -2456,7 +2438,7 @@
           <w:i/>
           <w:sz w:val="22"/>
         </w:rPr>
-        <w:t>Graficos cuantil-cuantil contra distribucion normal. Las desviaciones respecto a la diagonal evidencian no normalidad. Elaboracion propia.</w:t>
+        <w:t>Gráficos Q-Q contra distribución normal.</w:t>
       </w:r>
     </w:p>
     <w:p>
@@ -2468,7 +2450,7 @@
           <w:rFonts w:ascii="Times New Roman" w:hAnsi="Times New Roman"/>
           <w:sz w:val="24"/>
         </w:rPr>
-        <w:t>La lectura de los graficos cuantil-cuantil de la Figura 2 confirma visualmente la no normalidad de las seis variables. En el caso de age los puntos siguen la diagonal en la region central pero se desvian ligeramente en los extremos, lo que sugiere colas mas pesadas que las esperadas en una distribucion normal. Para trestbps y chol la desviacion es marcada en la cola superior, evidenciando la presencia de valores extremos que se tratan en la seccion IV. La variable thalach muestra una desviacion en la cola inferior asociada a pacientes con frecuencias cardiacas anormalmente bajas. Los graficos de oldpeak y ca son los que mas se alejan de la diagonal: ambos presentan una clara forma de escalera por su naturaleza discreta o semi-discreta, con concentracion masiva de observaciones en cero y asimetria positiva muy pronunciada.</w:t>
+        <w:t>En los Q-Q plots de la Figura 2 se ve que casi ninguna variable sigue la diagonal completa. En age los puntos se separan en los extremos, lo que indica colas pesadas. En trestbps y chol la desviación es mayor en la cola superior (de nuevo los outliers). Los Q-Q de oldpeak y ca son los más distintos a la normal: tienen forma de escalera porque son variables casi discretas con muchos ceros.</w:t>
       </w:r>
     </w:p>
     <w:p>
@@ -2490,7 +2472,7 @@
           <w:i/>
           <w:sz w:val="22"/>
         </w:rPr>
-        <w:t>Resultados de la prueba de Shapiro-Wilk para normalidad</w:t>
+        <w:t>Resultados de la prueba de Shapiro-Wilk</w:t>
       </w:r>
     </w:p>
     <w:tbl>
@@ -2532,7 +2514,7 @@
                 <w:b/>
                 <w:sz w:val="21"/>
               </w:rPr>
-              <w:t>Estadistico W</w:t>
+              <w:t>W</w:t>
             </w:r>
           </w:p>
         </w:tc>
@@ -2547,7 +2529,7 @@
                 <w:b/>
                 <w:sz w:val="21"/>
               </w:rPr>
-              <w:t>p valor</w:t>
+              <w:t>p-valor</w:t>
             </w:r>
           </w:p>
         </w:tc>
@@ -2562,7 +2544,7 @@
                 <w:b/>
                 <w:sz w:val="21"/>
               </w:rPr>
-              <w:t>Decision (alpha = 0.05)</w:t>
+              <w:t>Decisión (α = 0.05)</w:t>
             </w:r>
           </w:p>
         </w:tc>
@@ -2620,7 +2602,7 @@
                 <w:rFonts w:ascii="Times New Roman" w:hAnsi="Times New Roman"/>
                 <w:sz w:val="21"/>
               </w:rPr>
-              <w:t>Rechaza H0 (no normal)</w:t>
+              <w:t>Rechaza H₀ (no normal)</w:t>
             </w:r>
           </w:p>
         </w:tc>
@@ -2678,7 +2660,7 @@
                 <w:rFonts w:ascii="Times New Roman" w:hAnsi="Times New Roman"/>
                 <w:sz w:val="21"/>
               </w:rPr>
-              <w:t>Rechaza H0 (no normal)</w:t>
+              <w:t>Rechaza H₀ (no normal)</w:t>
             </w:r>
           </w:p>
         </w:tc>
@@ -2722,7 +2704,7 @@
                 <w:rFonts w:ascii="Times New Roman" w:hAnsi="Times New Roman"/>
                 <w:sz w:val="21"/>
               </w:rPr>
-              <w:t>&lt;0.000001</w:t>
+              <w:t>&lt; 0.000001</w:t>
             </w:r>
           </w:p>
         </w:tc>
@@ -2736,7 +2718,7 @@
                 <w:rFonts w:ascii="Times New Roman" w:hAnsi="Times New Roman"/>
                 <w:sz w:val="21"/>
               </w:rPr>
-              <w:t>Rechaza H0 (no normal)</w:t>
+              <w:t>Rechaza H₀ (no normal)</w:t>
             </w:r>
           </w:p>
         </w:tc>
@@ -2794,7 +2776,7 @@
                 <w:rFonts w:ascii="Times New Roman" w:hAnsi="Times New Roman"/>
                 <w:sz w:val="21"/>
               </w:rPr>
-              <w:t>Rechaza H0 (no normal)</w:t>
+              <w:t>Rechaza H₀ (no normal)</w:t>
             </w:r>
           </w:p>
         </w:tc>
@@ -2838,7 +2820,7 @@
                 <w:rFonts w:ascii="Times New Roman" w:hAnsi="Times New Roman"/>
                 <w:sz w:val="21"/>
               </w:rPr>
-              <w:t>&lt;0.000001</w:t>
+              <w:t>&lt; 0.000001</w:t>
             </w:r>
           </w:p>
         </w:tc>
@@ -2852,7 +2834,7 @@
                 <w:rFonts w:ascii="Times New Roman" w:hAnsi="Times New Roman"/>
                 <w:sz w:val="21"/>
               </w:rPr>
-              <w:t>Rechaza H0 (no normal)</w:t>
+              <w:t>Rechaza H₀ (no normal)</w:t>
             </w:r>
           </w:p>
         </w:tc>
@@ -2896,7 +2878,7 @@
                 <w:rFonts w:ascii="Times New Roman" w:hAnsi="Times New Roman"/>
                 <w:sz w:val="21"/>
               </w:rPr>
-              <w:t>&lt;0.000001</w:t>
+              <w:t>&lt; 0.000001</w:t>
             </w:r>
           </w:p>
         </w:tc>
@@ -2910,7 +2892,7 @@
                 <w:rFonts w:ascii="Times New Roman" w:hAnsi="Times New Roman"/>
                 <w:sz w:val="21"/>
               </w:rPr>
-              <w:t>Rechaza H0 (no normal)</w:t>
+              <w:t>Rechaza H₀ (no normal)</w:t>
             </w:r>
           </w:p>
         </w:tc>
@@ -2926,7 +2908,7 @@
           <w:rFonts w:ascii="Times New Roman" w:hAnsi="Times New Roman"/>
           <w:sz w:val="24"/>
         </w:rPr>
-        <w:t>Las seis variables rechazan la hipotesis de normalidad. Este resultado cuantitativo es coherente con la inspeccion visual de la Figura 2: las variables con estadistico W mas bajo (ca = 0.7187 y oldpeak = 0.8442) son precisamente las que mostraron las desviaciones mas severas en los Q-Q plots. La consecuencia metodologica es que las pruebas posteriores deben privilegiar estadisticos robustos (mediana, IQR) sobre la media, y que las tecnicas de modelado seleccionadas en el Entregable 2 no deben asumir normalidad de las features.</w:t>
+        <w:t>Las seis variables rechazan la hipótesis de normalidad. Era de esperarse por lo que se veía en los Q-Q plots: las que tienen W más bajo (ca y oldpeak) son justamente las que más se alejan de la diagonal. La consecuencia práctica es que en la imputación vamos a usar la mediana en vez de la media.</w:t>
       </w:r>
     </w:p>
     <w:p>
@@ -2952,7 +2934,7 @@
           <w:rFonts w:ascii="Times New Roman" w:hAnsi="Times New Roman"/>
           <w:sz w:val="24"/>
         </w:rPr>
-        <w:t>El dataset original codifica los nulos como signo de interrogacion. Tras la lectura adecuada, se detectaron seis valores faltantes distribuidos en dos variables: cuatro en ca (1.32%) y dos en thal (0.66%). El porcentaje de perdida es bajo, lo que descarta la eliminacion de registros y favorece la imputacion.</w:t>
+        <w:t>En el dataset original los nulos vienen marcados como '?'. Al leer el archivo con pandas indicándole na_values='?' aparecen seis nulos: cuatro en ca y dos en thal. Como es muy poco (menos del 2 % del total), no tiene sentido eliminar filas; lo lógico es imputar.</w:t>
       </w:r>
     </w:p>
     <w:p>
@@ -2963,7 +2945,7 @@
       <w:r>
         <w:drawing>
           <wp:inline xmlns:a="http://schemas.openxmlformats.org/drawingml/2006/main" xmlns:pic="http://schemas.openxmlformats.org/drawingml/2006/picture">
-            <wp:extent cx="5486400" cy="2143212"/>
+            <wp:extent cx="5486400" cy="2133157"/>
             <wp:docPr id="3" name="Picture 3"/>
             <wp:cNvGraphicFramePr>
               <a:graphicFrameLocks noChangeAspect="1"/>
@@ -2984,7 +2966,7 @@
                   <pic:spPr>
                     <a:xfrm>
                       <a:off x="0" y="0"/>
-                      <a:ext cx="5486400" cy="2143212"/>
+                      <a:ext cx="5486400" cy="2133157"/>
                     </a:xfrm>
                     <a:prstGeom prst="rect"/>
                   </pic:spPr>
@@ -2998,7 +2980,6 @@
     <w:p>
       <w:pPr>
         <w:ind w:firstLine="0"/>
-        <w:jc w:val="left"/>
       </w:pPr>
       <w:r>
         <w:rPr>
@@ -3015,7 +2996,7 @@
           <w:i/>
           <w:sz w:val="22"/>
         </w:rPr>
-        <w:t>Mapa de calor de los valores faltantes en el dataset. Cada celda oscura corresponde a un valor ausente. Elaboracion propia.</w:t>
+        <w:t>Mapa de calor de los datos faltantes.</w:t>
       </w:r>
     </w:p>
     <w:p>
@@ -3037,7 +3018,7 @@
           <w:i/>
           <w:sz w:val="22"/>
         </w:rPr>
-        <w:t>Prueba de rachas de Wald-Wolfowitz sobre el patron de nulos</w:t>
+        <w:t>Prueba de rachas sobre el patrón de nulos</w:t>
       </w:r>
     </w:p>
     <w:tbl>
@@ -3110,7 +3091,7 @@
                 <w:b/>
                 <w:sz w:val="21"/>
               </w:rPr>
-              <w:t>p valor</w:t>
+              <w:t>p-valor</w:t>
             </w:r>
           </w:p>
         </w:tc>
@@ -3125,7 +3106,7 @@
                 <w:b/>
                 <w:sz w:val="21"/>
               </w:rPr>
-              <w:t>Decision</w:t>
+              <w:t>Decisión</w:t>
             </w:r>
           </w:p>
         </w:tc>
@@ -3169,7 +3150,7 @@
                 <w:rFonts w:ascii="Times New Roman" w:hAnsi="Times New Roman"/>
                 <w:sz w:val="21"/>
               </w:rPr>
-              <w:t>-2.1068</w:t>
+              <w:t>−2.1068</w:t>
             </w:r>
           </w:p>
         </w:tc>
@@ -3285,7 +3266,7 @@
           <w:rFonts w:ascii="Times New Roman" w:hAnsi="Times New Roman"/>
           <w:sz w:val="24"/>
         </w:rPr>
-        <w:t>El resultado de la variable ca indica que los datos faltantes no estan distribuidos aleatoriamente. En consecuencia, una imputacion simple por tendencia central podria introducir sesgo y se justifica explorar una imputacion multivariada que aproveche la dependencia con otras variables.</w:t>
+        <w:t>El resultado en ca es interesante: el p-valor sale por debajo de 0.05, lo que significa que los nulos no aparecen al azar. Esto es un argumento adicional para no usar imputación simple, porque podría estar reforzando un sesgo. En thal sí parece aleatorio.</w:t>
       </w:r>
     </w:p>
     <w:p>
@@ -3311,7 +3292,7 @@
           <w:rFonts w:ascii="Times New Roman" w:hAnsi="Times New Roman"/>
           <w:sz w:val="24"/>
         </w:rPr>
-        <w:t>Se aplico la regla 1.5 * IQR para identificar valores atipicos en las variables numericas. La Figura 4 muestra los boxplots originales.</w:t>
+        <w:t>Apliqué la regla 1.5·IQR a las seis variables continuas. La Figura 4 muestra los boxplots antes de tratar nada.</w:t>
       </w:r>
     </w:p>
     <w:p>
@@ -3322,7 +3303,7 @@
       <w:r>
         <w:drawing>
           <wp:inline xmlns:a="http://schemas.openxmlformats.org/drawingml/2006/main" xmlns:pic="http://schemas.openxmlformats.org/drawingml/2006/picture">
-            <wp:extent cx="5486400" cy="3107903"/>
+            <wp:extent cx="5486400" cy="3101501"/>
             <wp:docPr id="4" name="Picture 4"/>
             <wp:cNvGraphicFramePr>
               <a:graphicFrameLocks noChangeAspect="1"/>
@@ -3343,7 +3324,7 @@
                   <pic:spPr>
                     <a:xfrm>
                       <a:off x="0" y="0"/>
-                      <a:ext cx="5486400" cy="3107903"/>
+                      <a:ext cx="5486400" cy="3101501"/>
                     </a:xfrm>
                     <a:prstGeom prst="rect"/>
                   </pic:spPr>
@@ -3357,7 +3338,6 @@
     <w:p>
       <w:pPr>
         <w:ind w:firstLine="0"/>
-        <w:jc w:val="left"/>
       </w:pPr>
       <w:r>
         <w:rPr>
@@ -3374,7 +3354,7 @@
           <w:i/>
           <w:sz w:val="22"/>
         </w:rPr>
-        <w:t>Boxplots de las variables numericas antes del tratamiento de outliers. Elaboracion propia.</w:t>
+        <w:t>Boxplots antes del tratamiento de outliers.</w:t>
       </w:r>
     </w:p>
     <w:p>
@@ -3396,7 +3376,7 @@
           <w:i/>
           <w:sz w:val="22"/>
         </w:rPr>
-        <w:t>Deteccion de outliers por la regla 1.5 * IQR</w:t>
+        <w:t>Outliers detectados por la regla 1.5·IQR</w:t>
       </w:r>
     </w:p>
     <w:tbl>
@@ -3438,7 +3418,7 @@
                 <w:b/>
                 <w:sz w:val="21"/>
               </w:rPr>
-              <w:t>Lim. inferior</w:t>
+              <w:t>Lím. inferior</w:t>
             </w:r>
           </w:p>
         </w:tc>
@@ -3453,7 +3433,7 @@
                 <w:b/>
                 <w:sz w:val="21"/>
               </w:rPr>
-              <w:t>Lim. superior</w:t>
+              <w:t>Lím. superior</w:t>
             </w:r>
           </w:p>
         </w:tc>
@@ -3730,7 +3710,7 @@
                 <w:rFonts w:ascii="Times New Roman" w:hAnsi="Times New Roman"/>
                 <w:sz w:val="21"/>
               </w:rPr>
-              <w:t>-2.40</w:t>
+              <w:t>−2.40</w:t>
             </w:r>
           </w:p>
         </w:tc>
@@ -3788,7 +3768,7 @@
                 <w:rFonts w:ascii="Times New Roman" w:hAnsi="Times New Roman"/>
                 <w:sz w:val="21"/>
               </w:rPr>
-              <w:t>-1.50</w:t>
+              <w:t>−1.50</w:t>
             </w:r>
           </w:p>
         </w:tc>
@@ -3832,7 +3812,7 @@
           <w:rFonts w:ascii="Times New Roman" w:hAnsi="Times New Roman"/>
           <w:sz w:val="24"/>
         </w:rPr>
-        <w:t>Se opto por la tecnica de capping o winsorizing en lugar de la eliminacion por dos razones. Primero, el tamano muestral es modesto (n = 303) y eliminar 40 observaciones representa una perdida del 13% de la informacion. Segundo, los outliers tienen sentido clinico: un paciente con colesterol de 564 mg/dl es un caso real y excepcional pero no un error de medicion. El capping conserva el registro y limita su influencia.</w:t>
+        <w:t>En total se detectaron 40 outliers. Si se eliminaran todos se perdería el 13 % del dataset, lo cual es bastante para un conjunto que ya es pequeño. Por eso decidí aplicar capping: los valores por encima del límite superior se reemplazan por el límite superior, y lo mismo en el extremo inferior. De esta forma no se pierden filas y se evita que valores extremos como un colesterol de 564 mg/dl distorsionen el modelo (aunque clínicamente sí puede ser un valor real y no un error de medición).</w:t>
       </w:r>
     </w:p>
     <w:p>
@@ -3843,7 +3823,7 @@
       <w:r>
         <w:drawing>
           <wp:inline xmlns:a="http://schemas.openxmlformats.org/drawingml/2006/main" xmlns:pic="http://schemas.openxmlformats.org/drawingml/2006/picture">
-            <wp:extent cx="5486400" cy="3098946"/>
+            <wp:extent cx="5486400" cy="3090333"/>
             <wp:docPr id="5" name="Picture 5"/>
             <wp:cNvGraphicFramePr>
               <a:graphicFrameLocks noChangeAspect="1"/>
@@ -3864,7 +3844,7 @@
                   <pic:spPr>
                     <a:xfrm>
                       <a:off x="0" y="0"/>
-                      <a:ext cx="5486400" cy="3098946"/>
+                      <a:ext cx="5486400" cy="3090333"/>
                     </a:xfrm>
                     <a:prstGeom prst="rect"/>
                   </pic:spPr>
@@ -3878,7 +3858,6 @@
     <w:p>
       <w:pPr>
         <w:ind w:firstLine="0"/>
-        <w:jc w:val="left"/>
       </w:pPr>
       <w:r>
         <w:rPr>
@@ -3895,7 +3874,7 @@
           <w:i/>
           <w:sz w:val="22"/>
         </w:rPr>
-        <w:t>Boxplots despues de aplicar capping a los valores fuera del rango 1.5 * IQR. Elaboracion propia.</w:t>
+        <w:t>Boxplots después del capping.</w:t>
       </w:r>
     </w:p>
     <w:p>
@@ -3909,7 +3888,7 @@
           <w:b/>
           <w:sz w:val="26"/>
         </w:rPr>
-        <w:t>V. Imputacion comparativa</w:t>
+        <w:t>V. Imputación comparativa</w:t>
       </w:r>
     </w:p>
     <w:p>
@@ -3921,7 +3900,35 @@
           <w:rFonts w:ascii="Times New Roman" w:hAnsi="Times New Roman"/>
           <w:sz w:val="24"/>
         </w:rPr>
-        <w:t>Se compararon dos tecnicas de imputacion sobre la variable ca, la de mayor cantidad de nulos y con patron no aleatorio segun la prueba de rachas. La primera tecnica es la imputacion simple por mediana, elegida frente a la media debido a la no normalidad demostrada en la seccion anterior. La segunda es la imputacion iterativa multivariada con un estimador BayesianRidge, implementada mediante IterativeImputer de scikit-learn.</w:t>
+        <w:t>Para comparar las dos técnicas de imputación elegí la variable ca porque tiene más nulos y porque la prueba de rachas dio patrón no aleatorio. Probé:</w:t>
+      </w:r>
+    </w:p>
+    <w:p>
+      <w:pPr>
+        <w:pStyle w:val="ListBullet"/>
+        <w:ind w:firstLine="0"/>
+        <w:jc w:val="both"/>
+      </w:pPr>
+      <w:r>
+        <w:rPr>
+          <w:rFonts w:ascii="Times New Roman" w:hAnsi="Times New Roman"/>
+          <w:sz w:val="24"/>
+        </w:rPr>
+        <w:t>Imputación simple con la mediana (no con la media porque la variable no es normal).</w:t>
+      </w:r>
+    </w:p>
+    <w:p>
+      <w:pPr>
+        <w:pStyle w:val="ListBullet"/>
+        <w:ind w:firstLine="0"/>
+        <w:jc w:val="both"/>
+      </w:pPr>
+      <w:r>
+        <w:rPr>
+          <w:rFonts w:ascii="Times New Roman" w:hAnsi="Times New Roman"/>
+          <w:sz w:val="24"/>
+        </w:rPr>
+        <w:t>Imputación por regresión usando IterativeImputer con BayesianRidge como estimador.</w:t>
       </w:r>
     </w:p>
     <w:p>
@@ -3932,7 +3939,7 @@
       <w:r>
         <w:drawing>
           <wp:inline xmlns:a="http://schemas.openxmlformats.org/drawingml/2006/main" xmlns:pic="http://schemas.openxmlformats.org/drawingml/2006/picture">
-            <wp:extent cx="5486400" cy="1503218"/>
+            <wp:extent cx="5486400" cy="1497866"/>
             <wp:docPr id="6" name="Picture 6"/>
             <wp:cNvGraphicFramePr>
               <a:graphicFrameLocks noChangeAspect="1"/>
@@ -3953,7 +3960,7 @@
                   <pic:spPr>
                     <a:xfrm>
                       <a:off x="0" y="0"/>
-                      <a:ext cx="5486400" cy="1503218"/>
+                      <a:ext cx="5486400" cy="1497866"/>
                     </a:xfrm>
                     <a:prstGeom prst="rect"/>
                   </pic:spPr>
@@ -3967,7 +3974,6 @@
     <w:p>
       <w:pPr>
         <w:ind w:firstLine="0"/>
-        <w:jc w:val="left"/>
       </w:pPr>
       <w:r>
         <w:rPr>
@@ -3984,7 +3990,7 @@
           <w:i/>
           <w:sz w:val="22"/>
         </w:rPr>
-        <w:t>Comparacion de distribuciones para la variable ca: original (con nulos), imputacion simple por mediana e imputacion por regresion bayesiana. Elaboracion propia.</w:t>
+        <w:t>Comparación de la variable ca: original, imputación por mediana e imputación por regresión.</w:t>
       </w:r>
     </w:p>
     <w:p>
@@ -4006,7 +4012,7 @@
           <w:i/>
           <w:sz w:val="22"/>
         </w:rPr>
-        <w:t>Comparacion estadistica de la imputacion en la variable ca</w:t>
+        <w:t>Comparación de la imputación en ca</w:t>
       </w:r>
     </w:p>
     <w:tbl>
@@ -4033,7 +4039,7 @@
                 <w:b/>
                 <w:sz w:val="21"/>
               </w:rPr>
-              <w:t>Estadistico</w:t>
+              <w:t>Estadístico</w:t>
             </w:r>
           </w:p>
         </w:tc>
@@ -4078,7 +4084,7 @@
                 <w:b/>
                 <w:sz w:val="21"/>
               </w:rPr>
-              <w:t>Imp. regresion</w:t>
+              <w:t>Imp. regresión</w:t>
             </w:r>
           </w:p>
         </w:tc>
@@ -4210,7 +4216,7 @@
                 <w:rFonts w:ascii="Times New Roman" w:hAnsi="Times New Roman"/>
                 <w:sz w:val="21"/>
               </w:rPr>
-              <w:t>desv. estandar</w:t>
+              <w:t>desv. estándar</w:t>
             </w:r>
           </w:p>
         </w:tc>
@@ -4282,7 +4288,7 @@
                 <w:rFonts w:ascii="Times New Roman" w:hAnsi="Times New Roman"/>
                 <w:sz w:val="21"/>
               </w:rPr>
-              <w:t>0.0000</w:t>
+              <w:t>0</w:t>
             </w:r>
           </w:p>
         </w:tc>
@@ -4296,7 +4302,7 @@
                 <w:rFonts w:ascii="Times New Roman" w:hAnsi="Times New Roman"/>
                 <w:sz w:val="21"/>
               </w:rPr>
-              <w:t>0.0000</w:t>
+              <w:t>0</w:t>
             </w:r>
           </w:p>
         </w:tc>
@@ -4310,7 +4316,7 @@
                 <w:rFonts w:ascii="Times New Roman" w:hAnsi="Times New Roman"/>
                 <w:sz w:val="21"/>
               </w:rPr>
-              <w:t>0.0000</w:t>
+              <w:t>0</w:t>
             </w:r>
           </w:p>
         </w:tc>
@@ -4326,7 +4332,7 @@
                 <w:rFonts w:ascii="Times New Roman" w:hAnsi="Times New Roman"/>
                 <w:sz w:val="21"/>
               </w:rPr>
-              <w:t>minimo</w:t>
+              <w:t>mínimo</w:t>
             </w:r>
           </w:p>
         </w:tc>
@@ -4340,7 +4346,7 @@
                 <w:rFonts w:ascii="Times New Roman" w:hAnsi="Times New Roman"/>
                 <w:sz w:val="21"/>
               </w:rPr>
-              <w:t>0.0000</w:t>
+              <w:t>0</w:t>
             </w:r>
           </w:p>
         </w:tc>
@@ -4354,7 +4360,7 @@
                 <w:rFonts w:ascii="Times New Roman" w:hAnsi="Times New Roman"/>
                 <w:sz w:val="21"/>
               </w:rPr>
-              <w:t>0.0000</w:t>
+              <w:t>0</w:t>
             </w:r>
           </w:p>
         </w:tc>
@@ -4368,7 +4374,7 @@
                 <w:rFonts w:ascii="Times New Roman" w:hAnsi="Times New Roman"/>
                 <w:sz w:val="21"/>
               </w:rPr>
-              <w:t>-0.0478</w:t>
+              <w:t>−0.0478</w:t>
             </w:r>
           </w:p>
         </w:tc>
@@ -4384,7 +4390,7 @@
                 <w:rFonts w:ascii="Times New Roman" w:hAnsi="Times New Roman"/>
                 <w:sz w:val="21"/>
               </w:rPr>
-              <w:t>maximo</w:t>
+              <w:t>máximo</w:t>
             </w:r>
           </w:p>
         </w:tc>
@@ -4398,7 +4404,7 @@
                 <w:rFonts w:ascii="Times New Roman" w:hAnsi="Times New Roman"/>
                 <w:sz w:val="21"/>
               </w:rPr>
-              <w:t>3.0000</w:t>
+              <w:t>3</w:t>
             </w:r>
           </w:p>
         </w:tc>
@@ -4412,7 +4418,7 @@
                 <w:rFonts w:ascii="Times New Roman" w:hAnsi="Times New Roman"/>
                 <w:sz w:val="21"/>
               </w:rPr>
-              <w:t>2.5000</w:t>
+              <w:t>2.5</w:t>
             </w:r>
           </w:p>
         </w:tc>
@@ -4426,7 +4432,7 @@
                 <w:rFonts w:ascii="Times New Roman" w:hAnsi="Times New Roman"/>
                 <w:sz w:val="21"/>
               </w:rPr>
-              <w:t>2.5000</w:t>
+              <w:t>2.5</w:t>
             </w:r>
           </w:p>
         </w:tc>
@@ -4442,7 +4448,7 @@
           <w:rFonts w:ascii="Times New Roman" w:hAnsi="Times New Roman"/>
           <w:sz w:val="24"/>
         </w:rPr>
-        <w:t>Ambas tecnicas reducen la desviacion estandar respecto al original. La imputacion por regresion produce valores continuos cercanos a cero, compatibles con la moda de la variable pero con variabilidad que captura la relacion multivariada con age, thalach y oldpeak. La imputacion por mediana, en cambio, replica el valor cero y refuerza el sesgo. Por esta razon se conserva el dataset imputado por regresion bayesiana para el segundo entregable.</w:t>
+        <w:t>Las dos técnicas reducen un poco la desviación estándar respecto al original (algo esperado al imputar). La diferencia importante es que la imputación por mediana solo agrega ceros, lo que refuerza el sesgo, mientras que la imputación por regresión predice valores continuos cercanos a cero pero usando la información de las demás variables. Por eso conservo el dataset imputado por regresión para el segundo entregable.</w:t>
       </w:r>
     </w:p>
     <w:p>
@@ -4453,7 +4459,7 @@
       <w:r>
         <w:drawing>
           <wp:inline xmlns:a="http://schemas.openxmlformats.org/drawingml/2006/main" xmlns:pic="http://schemas.openxmlformats.org/drawingml/2006/picture">
-            <wp:extent cx="5486400" cy="4849310"/>
+            <wp:extent cx="5486400" cy="4845362"/>
             <wp:docPr id="7" name="Picture 7"/>
             <wp:cNvGraphicFramePr>
               <a:graphicFrameLocks noChangeAspect="1"/>
@@ -4474,7 +4480,7 @@
                   <pic:spPr>
                     <a:xfrm>
                       <a:off x="0" y="0"/>
-                      <a:ext cx="5486400" cy="4849310"/>
+                      <a:ext cx="5486400" cy="4845362"/>
                     </a:xfrm>
                     <a:prstGeom prst="rect"/>
                   </pic:spPr>
@@ -4488,7 +4494,6 @@
     <w:p>
       <w:pPr>
         <w:ind w:firstLine="0"/>
-        <w:jc w:val="left"/>
       </w:pPr>
       <w:r>
         <w:rPr>
@@ -4505,7 +4510,7 @@
           <w:i/>
           <w:sz w:val="22"/>
         </w:rPr>
-        <w:t>Matriz de correlacion del dataset preprocesado. Elaboracion propia.</w:t>
+        <w:t>Matriz de correlación del dataset preprocesado.</w:t>
       </w:r>
     </w:p>
     <w:p>
@@ -4537,7 +4542,7 @@
           <w:rFonts w:ascii="Times New Roman" w:hAnsi="Times New Roman"/>
           <w:sz w:val="24"/>
         </w:rPr>
-        <w:t>El analisis exploratorio del dataset Heart Disease evidencio la importancia del preprocesamiento en la fase temprana de un proyecto de ciencia de datos. Las seis variables numericas analizadas son no normales, lo que obligo a privilegiar estadisticos robustos como la mediana y el IQR.</w:t>
+        <w:t>Después de todo el preprocesamiento aplicado, las conclusiones principales son las siguientes.</w:t>
       </w:r>
     </w:p>
     <w:p>
@@ -4549,7 +4554,7 @@
           <w:rFonts w:ascii="Times New Roman" w:hAnsi="Times New Roman"/>
           <w:sz w:val="24"/>
         </w:rPr>
-        <w:t>La prueba de rachas revelo que el patron de nulos en la variable ca no es completamente aleatorio, lo que justifica el uso de imputacion multivariada en lugar de imputacion por tendencia central. La comparacion entre ambas tecnicas mostro que la imputacion por regresion bayesiana iterativa preserva mejor la varianza original.</w:t>
+        <w:t>Primero, las seis variables continuas analizadas no siguen una distribución normal. Esto obliga a usar estadísticos robustos (mediana, IQR) y a tener cuidado al elegir las técnicas posteriores.</w:t>
       </w:r>
     </w:p>
     <w:p>
@@ -4561,7 +4566,7 @@
           <w:rFonts w:ascii="Times New Roman" w:hAnsi="Times New Roman"/>
           <w:sz w:val="24"/>
         </w:rPr>
-        <w:t>El tratamiento de outliers mediante capping permitio conservar el tamano muestral integro (n = 303) sin sacrificar el control de los valores extremos. Esta decision es especialmente relevante en datasets clinicos donde cada paciente aporta evidencia.</w:t>
+        <w:t>Segundo, los nulos de la variable ca no aparecen al azar según la prueba de rachas. Esto refuerza la decisión de usar imputación por regresión y no por mediana, porque esta última habría profundizado el sesgo de los ceros.</w:t>
       </w:r>
     </w:p>
     <w:p>
@@ -4573,7 +4578,19 @@
           <w:rFonts w:ascii="Times New Roman" w:hAnsi="Times New Roman"/>
           <w:sz w:val="24"/>
         </w:rPr>
-        <w:t>El dataset preprocesado, persistido como heart_disease_preprocesado.csv, esta listo para la siguiente fase del proyecto: la reduccion de dimensionalidad mediante PCA, la seleccion de caracteristicas por correlacion y el entrenamiento comparativo de al menos dos modelos supervisados (regresion logistica y arboles de decision).</w:t>
+        <w:t>Tercero, el capping permitió manejar los 40 outliers sin perder ninguna fila. En un dataset clínico con solo 303 registros, conservar el tamaño muestral es importante.</w:t>
+      </w:r>
+    </w:p>
+    <w:p>
+      <w:pPr>
+        <w:jc w:val="both"/>
+      </w:pPr>
+      <w:r>
+        <w:rPr>
+          <w:rFonts w:ascii="Times New Roman" w:hAnsi="Times New Roman"/>
+          <w:sz w:val="24"/>
+        </w:rPr>
+        <w:t>El dataset preprocesado queda guardado como heart_disease_preprocesado.csv y servirá de base para el segundo entregable, donde se aplicará PCA, selección de features y se compararán dos modelos supervisados.</w:t>
       </w:r>
     </w:p>
     <w:p>
@@ -4619,7 +4636,7 @@
           <w:rFonts w:ascii="Times New Roman" w:hAnsi="Times New Roman"/>
           <w:sz w:val="24"/>
         </w:rPr>
-        <w:t>Detrano, R., Janosi, A., Steinbrunn, W., Pfisterer, M., Schmid, J. J., Sandhu, S., Guppy, K. H., Lee, S., y Froelicher, V. (1989). International application of a new probability algorithm for the diagnosis of coronary artery disease. The American Journal of Cardiology, 64(5), 304-310. https://doi.org/10.1016/0002-9149(89)90524-9</w:t>
+        <w:t>Detrano, R., Janosi, A., Steinbrunn, W., Pfisterer, M., Schmid, J. J., Sandhu, S., Guppy, K. H., Lee, S., y Froelicher, V. (1989). International application of a new probability algorithm for the diagnosis of coronary artery disease. The American Journal of Cardiology, 64(5), 304-310.</w:t>
       </w:r>
     </w:p>
     <w:p>
@@ -4632,7 +4649,7 @@
           <w:rFonts w:ascii="Times New Roman" w:hAnsi="Times New Roman"/>
           <w:sz w:val="24"/>
         </w:rPr>
-        <w:t>Dua, D., y Graff, C. (2019). UCI Machine Learning Repository. University of California, Irvine, School of Information and Computer Sciences. https://archive.ics.uci.edu/ml/datasets/Heart+Disease</w:t>
+        <w:t>Dua, D., y Graff, C. (2019). UCI Machine Learning Repository. University of California, Irvine. https://archive.ics.uci.edu/ml/datasets/Heart+Disease</w:t>
       </w:r>
     </w:p>
     <w:p>
@@ -4658,7 +4675,7 @@
           <w:rFonts w:ascii="Times New Roman" w:hAnsi="Times New Roman"/>
           <w:sz w:val="24"/>
         </w:rPr>
-        <w:t>Rubin, D. B. (1976). Inference and missing data. Biometrika, 63(3), 581-592. https://doi.org/10.1093/biomet/63.3.581</w:t>
+        <w:t>Rubin, D. B. (1976). Inference and missing data. Biometrika, 63(3), 581-592.</w:t>
       </w:r>
     </w:p>
     <w:p>
@@ -4671,7 +4688,7 @@
           <w:rFonts w:ascii="Times New Roman" w:hAnsi="Times New Roman"/>
           <w:sz w:val="24"/>
         </w:rPr>
-        <w:t>Shapiro, S. S., y Wilk, M. B. (1965). An analysis of variance test for normality (complete samples). Biometrika, 52(3-4), 591-611. https://doi.org/10.1093/biomet/52.3-4.591</w:t>
+        <w:t>Shapiro, S. S., y Wilk, M. B. (1965). An analysis of variance test for normality (complete samples). Biometrika, 52(3-4), 591-611.</w:t>
       </w:r>
     </w:p>
     <w:p>
@@ -4697,7 +4714,7 @@
           <w:rFonts w:ascii="Times New Roman" w:hAnsi="Times New Roman"/>
           <w:sz w:val="24"/>
         </w:rPr>
-        <w:t>van Buuren, S. (2018). Flexible imputation of missing data (2.a ed.). Chapman and Hall/CRC. https://doi.org/10.1201/9780429492259</w:t>
+        <w:t>van Buuren, S. (2018). Flexible imputation of missing data (2.ª ed.). Chapman and Hall/CRC.</w:t>
       </w:r>
     </w:p>
     <w:p>
@@ -4710,7 +4727,7 @@
           <w:rFonts w:ascii="Times New Roman" w:hAnsi="Times New Roman"/>
           <w:sz w:val="24"/>
         </w:rPr>
-        <w:t>Wald, A., y Wolfowitz, J. (1940). On a test whether two samples are from the same population. The Annals of Mathematical Statistics, 11(2), 147-162. https://doi.org/10.1214/aoms/1177731909</w:t>
+        <w:t>Wald, A., y Wolfowitz, J. (1940). On a test whether two samples are from the same population. The Annals of Mathematical Statistics, 11(2), 147-162.</w:t>
       </w:r>
     </w:p>
     <w:sectPr>
@@ -5104,7 +5121,7 @@
     <w:qFormat/>
     <w:rsid w:val="00FC693F"/>
     <w:pPr>
-      <w:spacing w:line="480" w:lineRule="auto" w:before="0" w:after="0"/>
+      <w:spacing w:line="480" w:lineRule="auto"/>
       <w:ind w:firstLine="720"/>
     </w:pPr>
     <w:rPr>

</xml_diff>